<commit_message>
Update CV with new email address
</commit_message>
<xml_diff>
--- a/jasoncvaugust2026.docx
+++ b/jasoncvaugust2026.docx
@@ -1,6 +1,6 @@
 
 <file path=word/document.xml><?xml version="1.0" encoding="utf-8"?>
-<w:document xmlns:wpc="http://schemas.microsoft.com/office/word/2010/wordprocessingCanvas" xmlns:mo="http://schemas.microsoft.com/office/mac/office/2008/main" xmlns:mc="http://schemas.openxmlformats.org/markup-compatibility/2006" xmlns:mv="urn:schemas-microsoft-com:mac:vml" xmlns:o="urn:schemas-microsoft-com:office:office" xmlns:r="http://schemas.openxmlformats.org/officeDocument/2006/relationships" xmlns:m="http://schemas.openxmlformats.org/officeDocument/2006/math" xmlns:v="urn:schemas-microsoft-com:vml" xmlns:wp14="http://schemas.microsoft.com/office/word/2010/wordprocessingDrawing" xmlns:wp="http://schemas.openxmlformats.org/drawingml/2006/wordprocessingDrawing" xmlns:w10="urn:schemas-microsoft-com:office:word" xmlns:w="http://schemas.openxmlformats.org/wordprocessingml/2006/main" xmlns:w14="http://schemas.microsoft.com/office/word/2010/wordml" xmlns:wpg="http://schemas.microsoft.com/office/word/2010/wordprocessingGroup" xmlns:wpi="http://schemas.microsoft.com/office/word/2010/wordprocessingInk" xmlns:wne="http://schemas.microsoft.com/office/word/2006/wordml" xmlns:wps="http://schemas.microsoft.com/office/word/2010/wordprocessingShape" mc:Ignorable="w14 wp14">
+<w:document xmlns:ve="http://schemas.openxmlformats.org/markup-compatibility/2006" xmlns:o="urn:schemas-microsoft-com:office:office" xmlns:r="http://schemas.openxmlformats.org/officeDocument/2006/relationships" xmlns:m="http://schemas.openxmlformats.org/officeDocument/2006/math" xmlns:v="urn:schemas-microsoft-com:vml" xmlns:wp="http://schemas.openxmlformats.org/drawingml/2006/wordprocessingDrawing" xmlns:w10="urn:schemas-microsoft-com:office:word" xmlns:w="http://schemas.openxmlformats.org/wordprocessingml/2006/main" xmlns:wne="http://schemas.microsoft.com/office/word/2006/wordml">
   <w:body>
     <w:p>
       <w:pPr>
@@ -22,8 +22,16 @@
     </w:p>
     <w:p>
       <w:r>
-        <w:t>Email: Jason.harvey@jasoncv.click</w:t>
+        <w:t xml:space="preserve">Email: </w:t>
       </w:r>
+      <w:hyperlink r:id="rId6" w:history="1">
+        <w:r>
+          <w:rPr>
+            <w:rStyle w:val="Hyperlink"/>
+          </w:rPr>
+          <w:t>jasonmariakieran@gmail.com</w:t>
+        </w:r>
+      </w:hyperlink>
     </w:p>
     <w:p>
       <w:r>
@@ -45,7 +53,13 @@
     </w:p>
     <w:p>
       <w:r>
-        <w:t>Aspiring AWS Cloud Engineer with hands-on experience delivering serverless and data solutions on AWS. Combines AWS Cloud Practitioner certification with practical project work in Lambda, EC2, S3, Glue, Athena, and Python automation. Background in IT support and service operations gives strong troubleshooting, incident management, and process discipline. Seeking a junior cloud or AWS-focused role where I can contribute to production cloud environments and grow into an engineering practice.</w:t>
+        <w:t xml:space="preserve">Aspiring AWS Cloud Engineer with hands-on experience delivering </w:t>
+      </w:r>
+      <w:r>
+        <w:t xml:space="preserve">serverless and data solutions on AWS. Combines AWS Cloud Practitioner certification with practical project work in Lambda, EC2, S3, Glue, Athena, and Python automation. Background in IT support and service operations gives strong troubleshooting, incident </w:t>
+      </w:r>
+      <w:r>
+        <w:t>management, and process discipline. Seeking a junior cloud or AWS-focused role where I can contribute to production cloud environments and grow into an engineering practice.</w:t>
       </w:r>
     </w:p>
     <w:p>
@@ -61,7 +75,10 @@
         <w:pStyle w:val="ListBullet"/>
       </w:pPr>
       <w:r>
-        <w:t>Cloud: AWS Lambda, EC2, S3, AWS Glue, Amazon Athena, Cloud Practitioner certification</w:t>
+        <w:t>Cloud: AWS Lambda, EC2, S3, AWS Glue, Amazon Athena, Cloud Practitioner</w:t>
+      </w:r>
+      <w:r>
+        <w:t xml:space="preserve"> certification</w:t>
       </w:r>
     </w:p>
     <w:p>
@@ -85,7 +102,10 @@
         <w:pStyle w:val="ListBullet"/>
       </w:pPr>
       <w:r>
-        <w:t>Collaboration &amp; Communication: ticket escalation, cross-team coordination, technical documentation</w:t>
+        <w:t>Collaboration &amp; Communication: ticket escalatio</w:t>
+      </w:r>
+      <w:r>
+        <w:t>n, cross-team coordination, technical documentation</w:t>
       </w:r>
     </w:p>
     <w:p>
@@ -133,7 +153,10 @@
         <w:pStyle w:val="ListBullet"/>
       </w:pPr>
       <w:r>
-        <w:t>Endpoint Security | Cisco | January 2024</w:t>
+        <w:t>Endpoint Security | Cis</w:t>
+      </w:r>
+      <w:r>
+        <w:t>co | January 2024</w:t>
       </w:r>
     </w:p>
     <w:p>
@@ -157,6 +180,7 @@
         <w:pStyle w:val="ListBullet"/>
       </w:pPr>
       <w:r>
+        <w:lastRenderedPageBreak/>
         <w:t>Prompt Engineer for AI Applications | Alison | July 2024</w:t>
       </w:r>
     </w:p>
@@ -173,7 +197,10 @@
         <w:pStyle w:val="ListBullet"/>
       </w:pPr>
       <w:r>
-        <w:t>SOC Member, Wireshark Expert, Malware Analyzer | Lets Defend | September 2023</w:t>
+        <w:t>SOC Member, Wireshark Expert, Malware Analyzer | Lets Defend | Septe</w:t>
+      </w:r>
+      <w:r>
+        <w:t>mber 2023</w:t>
       </w:r>
     </w:p>
     <w:p>
@@ -213,7 +240,13 @@
         <w:rPr>
           <w:b/>
         </w:rPr>
-        <w:t>Serverless Data Querying Solution</w:t>
+        <w:t xml:space="preserve">Serverless </w:t>
+      </w:r>
+      <w:r>
+        <w:rPr>
+          <w:b/>
+        </w:rPr>
+        <w:t>Data Querying Solution</w:t>
       </w:r>
     </w:p>
     <w:p>
@@ -229,7 +262,13 @@
         <w:rPr>
           <w:b/>
         </w:rPr>
-        <w:t>Serverless Contact Forms</w:t>
+        <w:t>Serverless Co</w:t>
+      </w:r>
+      <w:r>
+        <w:rPr>
+          <w:b/>
+        </w:rPr>
+        <w:t>ntact Forms</w:t>
       </w:r>
     </w:p>
     <w:p>
@@ -253,7 +292,10 @@
         <w:pStyle w:val="ListBullet2"/>
       </w:pPr>
       <w:r>
-        <w:t>Built automation workflows for SEO and website optimization using API-driven integrations. Integrated Google Calendar and market data APIs for practical agent tooling. Created AI-based tools including a CV evaluator, share price predictor, and crypto advisor.</w:t>
+        <w:t>Built automation workflows for SEO and websi</w:t>
+      </w:r>
+      <w:r>
+        <w:t>te optimization using API-driven integrations. Integrated Google Calendar and market data APIs for practical agent tooling. Created AI-based tools including a CV evaluator, share price predictor, and crypto advisor.</w:t>
       </w:r>
     </w:p>
     <w:p>
@@ -269,7 +311,10 @@
         <w:pStyle w:val="ListBullet2"/>
       </w:pPr>
       <w:r>
-        <w:t>Developed Retrieval-Augmented Generation agents using Google Gemini for personal data and business use cases. Extended agent capabilities with vulnerability-checking logic, calendar scheduling, and financial data visualization.</w:t>
+        <w:t>Developed Retrieval-Augmen</w:t>
+      </w:r>
+      <w:r>
+        <w:t>ted Generation agents using Google Gemini for personal data and business use cases. Extended agent capabilities with vulnerability-checking logic, calendar scheduling, and financial data visualization.</w:t>
       </w:r>
     </w:p>
     <w:p>
@@ -290,7 +335,10 @@
     </w:p>
     <w:p>
       <w:r>
-        <w:t>Cantium | October 2023 – February 2024</w:t>
+        <w:t>Cantium | Octob</w:t>
+      </w:r>
+      <w:r>
+        <w:t>er 2023 – February 2024</w:t>
       </w:r>
     </w:p>
     <w:p>
@@ -298,7 +346,10 @@
         <w:pStyle w:val="ListBullet"/>
       </w:pPr>
       <w:r>
-        <w:t>Delivered first-line IT support to Kent County Council staff, resolving issues with Microsoft Teams, Outlook, and 8x8 telephony. Performed troubleshooting for storage, printers, and access management, escalating to second-line support when required. Logged and tracked incidents in ServiceNow, improving resolution tracking and handover accuracy.</w:t>
+        <w:t>Delivered first-line IT support to Kent County Council staff, resolving issues with Microsoft Teams, Outlook, and 8x8 telephony. Performed troubleshooting for storage, printers, and access management, escalating to second-line suppo</w:t>
+      </w:r>
+      <w:r>
+        <w:t>rt when required. Logged and tracked incidents in ServiceNow, improving resolution tracking and handover accuracy.</w:t>
       </w:r>
     </w:p>
     <w:p>
@@ -306,6 +357,7 @@
         <w:rPr>
           <w:b/>
         </w:rPr>
+        <w:lastRenderedPageBreak/>
         <w:t>IT Helpdesk Analyst</w:t>
       </w:r>
     </w:p>
@@ -319,7 +371,13 @@
         <w:pStyle w:val="ListBullet"/>
       </w:pPr>
       <w:r>
-        <w:t>Provided remote first-line IT support across UK hospitals and gyms, handling M365, printers, network issues, and hardware. Investigated malware and security incidents, escalating confirmed threats to Security IT with documented findings. Monitored site and network health via SolarWinds, verifying outages and communicating updates until resolution. Supported payment systems, gate access, and Windows profile recovery to minimize business downtime.</w:t>
+        <w:t>Provided remote first-line IT support across UK hospitals and gyms, handli</w:t>
+      </w:r>
+      <w:r>
+        <w:t>ng M365, printers, network issues, and hardware. Investigated malware and security incidents, escalating confirmed threats to Security IT with documented findings. Monitored site and network health via SolarWinds, verifying outages and communicating update</w:t>
+      </w:r>
+      <w:r>
+        <w:t>s until resolution. Supported payment systems, gate access, and Windows profile recovery to minimize business downtime.</w:t>
       </w:r>
     </w:p>
     <w:p>
@@ -340,7 +398,10 @@
         <w:pStyle w:val="ListBullet"/>
       </w:pPr>
       <w:r>
-        <w:t>Manage inbound calls, message taking, and call routing for SME clients. Apply problem-solving and communication skills to support callers and coordinate with teams.</w:t>
+        <w:t>Manage inbound calls, message taking, and call routing for SME client</w:t>
+      </w:r>
+      <w:r>
+        <w:t>s. Apply problem-solving and communication skills to support callers and coordinate with teams.</w:t>
       </w:r>
     </w:p>
     <w:p>
@@ -361,7 +422,10 @@
         <w:pStyle w:val="ListBullet"/>
       </w:pPr>
       <w:r>
-        <w:t>Managed inbound and outbound communications across phone, email, and online channels. Scheduled appointments, resolved escalations, and maintained accurate service records.</w:t>
+        <w:t xml:space="preserve">Managed inbound and outbound communications across phone, email, and online channels. Scheduled </w:t>
+      </w:r>
+      <w:r>
+        <w:t>appointments, resolved escalations, and maintained accurate service records.</w:t>
       </w:r>
     </w:p>
     <w:p>
@@ -382,7 +446,10 @@
         <w:pStyle w:val="ListBullet"/>
       </w:pPr>
       <w:r>
-        <w:t>Processed and audited cash deposits for major retail clients, ensuring accuracy and compliance. Maintained detailed records and followed procedures for discrepancies, supporting audit readiness.</w:t>
+        <w:t xml:space="preserve">Processed and audited cash deposits for major retail clients, ensuring accuracy and compliance. Maintained detailed </w:t>
+      </w:r>
+      <w:r>
+        <w:t>records and followed procedures for discrepancies, supporting audit readiness.</w:t>
       </w:r>
     </w:p>
     <w:p>
@@ -403,7 +470,10 @@
         <w:pStyle w:val="ListBullet"/>
       </w:pPr>
       <w:r>
-        <w:t>Supported Blue Badge and education service inquiries, guiding applicants through processes and escalating complex cases.</w:t>
+        <w:t>Supported Blue Badge and education service inquiries, guiding applicants through processes and escal</w:t>
+      </w:r>
+      <w:r>
+        <w:t>ating complex cases.</w:t>
       </w:r>
     </w:p>
     <w:p>
@@ -422,7 +492,7 @@
 </file>
 
 <file path=word/numbering.xml><?xml version="1.0" encoding="utf-8"?>
-<w:numbering xmlns:wpc="http://schemas.microsoft.com/office/word/2010/wordprocessingCanvas" xmlns:mo="http://schemas.microsoft.com/office/mac/office/2008/main" xmlns:mc="http://schemas.openxmlformats.org/markup-compatibility/2006" xmlns:mv="urn:schemas-microsoft-com:mac:vml" xmlns:o="urn:schemas-microsoft-com:office:office" xmlns:r="http://schemas.openxmlformats.org/officeDocument/2006/relationships" xmlns:m="http://schemas.openxmlformats.org/officeDocument/2006/math" xmlns:v="urn:schemas-microsoft-com:vml" xmlns:wp14="http://schemas.microsoft.com/office/word/2010/wordprocessingDrawing" xmlns:wp="http://schemas.openxmlformats.org/drawingml/2006/wordprocessingDrawing" xmlns:w10="urn:schemas-microsoft-com:office:word" xmlns:w="http://schemas.openxmlformats.org/wordprocessingml/2006/main" xmlns:w14="http://schemas.microsoft.com/office/word/2010/wordml" xmlns:wpg="http://schemas.microsoft.com/office/word/2010/wordprocessingGroup" xmlns:wpi="http://schemas.microsoft.com/office/word/2010/wordprocessingInk" xmlns:wne="http://schemas.microsoft.com/office/word/2006/wordml" xmlns:wps="http://schemas.microsoft.com/office/word/2010/wordprocessingShape" mc:Ignorable="w14 wp14">
+<w:numbering xmlns:ve="http://schemas.openxmlformats.org/markup-compatibility/2006" xmlns:o="urn:schemas-microsoft-com:office:office" xmlns:r="http://schemas.openxmlformats.org/officeDocument/2006/relationships" xmlns:m="http://schemas.openxmlformats.org/officeDocument/2006/math" xmlns:v="urn:schemas-microsoft-com:vml" xmlns:wp="http://schemas.openxmlformats.org/drawingml/2006/wordprocessingDrawing" xmlns:w10="urn:schemas-microsoft-com:office:word" xmlns:w="http://schemas.openxmlformats.org/wordprocessingml/2006/main" xmlns:wne="http://schemas.microsoft.com/office/word/2006/wordml">
   <w:abstractNum w:abstractNumId="0">
     <w:nsid w:val="FFFFFF7C"/>
     <w:multiLevelType w:val="singleLevel"/>
@@ -625,7 +695,7 @@
 </file>
 
 <file path=word/styles.xml><?xml version="1.0" encoding="utf-8"?>
-<w:styles xmlns:mc="http://schemas.openxmlformats.org/markup-compatibility/2006" xmlns:r="http://schemas.openxmlformats.org/officeDocument/2006/relationships" xmlns:w="http://schemas.openxmlformats.org/wordprocessingml/2006/main" xmlns:w14="http://schemas.microsoft.com/office/word/2010/wordml" mc:Ignorable="w14">
+<w:styles xmlns:r="http://schemas.openxmlformats.org/officeDocument/2006/relationships" xmlns:w="http://schemas.openxmlformats.org/wordprocessingml/2006/main">
   <w:docDefaults>
     <w:rPrDefault>
       <w:rPr>
@@ -641,7 +711,7 @@
       </w:pPr>
     </w:pPrDefault>
   </w:docDefaults>
-  <w:latentStyles w:defLockedState="0" w:defUIPriority="99" w:defSemiHidden="1" w:defUnhideWhenUsed="1" w:defQFormat="0" w:count="276">
+  <w:latentStyles w:defLockedState="0" w:defUIPriority="99" w:defSemiHidden="1" w:defUnhideWhenUsed="1" w:defQFormat="0" w:count="267">
     <w:lsdException w:name="Normal" w:semiHidden="0" w:uiPriority="0" w:unhideWhenUsed="0" w:qFormat="1"/>
     <w:lsdException w:name="heading 1" w:semiHidden="0" w:uiPriority="9" w:unhideWhenUsed="0" w:qFormat="1"/>
     <w:lsdException w:name="heading 2" w:uiPriority="9" w:qFormat="1"/>
@@ -785,50 +855,6 @@
     <w:qFormat/>
     <w:rsid w:val="00FC693F"/>
   </w:style>
-  <w:style w:type="paragraph" w:styleId="Header">
-    <w:name w:val="header"/>
-    <w:basedOn w:val="Normal"/>
-    <w:link w:val="HeaderChar"/>
-    <w:uiPriority w:val="99"/>
-    <w:unhideWhenUsed/>
-    <w:rsid w:val="00E618BF"/>
-    <w:pPr>
-      <w:tabs>
-        <w:tab w:val="center" w:pos="4680"/>
-        <w:tab w:val="right" w:pos="9360"/>
-      </w:tabs>
-      <w:spacing w:after="0" w:line="240" w:lineRule="auto"/>
-    </w:pPr>
-  </w:style>
-  <w:style w:type="character" w:customStyle="1" w:styleId="HeaderChar">
-    <w:name w:val="Header Char"/>
-    <w:basedOn w:val="DefaultParagraphFont"/>
-    <w:link w:val="Header"/>
-    <w:uiPriority w:val="99"/>
-    <w:rsid w:val="00E618BF"/>
-  </w:style>
-  <w:style w:type="paragraph" w:styleId="Footer">
-    <w:name w:val="footer"/>
-    <w:basedOn w:val="Normal"/>
-    <w:link w:val="FooterChar"/>
-    <w:uiPriority w:val="99"/>
-    <w:unhideWhenUsed/>
-    <w:rsid w:val="00E618BF"/>
-    <w:pPr>
-      <w:tabs>
-        <w:tab w:val="center" w:pos="4680"/>
-        <w:tab w:val="right" w:pos="9360"/>
-      </w:tabs>
-      <w:spacing w:after="0" w:line="240" w:lineRule="auto"/>
-    </w:pPr>
-  </w:style>
-  <w:style w:type="character" w:customStyle="1" w:styleId="FooterChar">
-    <w:name w:val="Footer Char"/>
-    <w:basedOn w:val="DefaultParagraphFont"/>
-    <w:link w:val="Footer"/>
-    <w:uiPriority w:val="99"/>
-    <w:rsid w:val="00E618BF"/>
-  </w:style>
   <w:style w:type="paragraph" w:styleId="Heading1">
     <w:name w:val="heading 1"/>
     <w:basedOn w:val="Normal"/>
@@ -1049,6 +1075,7 @@
     <w:uiPriority w:val="99"/>
     <w:semiHidden/>
     <w:unhideWhenUsed/>
+    <w:qFormat/>
     <w:tblPr>
       <w:tblInd w:w="0" w:type="dxa"/>
       <w:tblCellMar>
@@ -1064,6 +1091,50 @@
     <w:uiPriority w:val="99"/>
     <w:semiHidden/>
     <w:unhideWhenUsed/>
+  </w:style>
+  <w:style w:type="paragraph" w:styleId="Header">
+    <w:name w:val="header"/>
+    <w:basedOn w:val="Normal"/>
+    <w:link w:val="HeaderChar"/>
+    <w:uiPriority w:val="99"/>
+    <w:unhideWhenUsed/>
+    <w:rsid w:val="00E618BF"/>
+    <w:pPr>
+      <w:tabs>
+        <w:tab w:val="center" w:pos="4680"/>
+        <w:tab w:val="right" w:pos="9360"/>
+      </w:tabs>
+      <w:spacing w:after="0" w:line="240" w:lineRule="auto"/>
+    </w:pPr>
+  </w:style>
+  <w:style w:type="character" w:customStyle="1" w:styleId="HeaderChar">
+    <w:name w:val="Header Char"/>
+    <w:basedOn w:val="DefaultParagraphFont"/>
+    <w:link w:val="Header"/>
+    <w:uiPriority w:val="99"/>
+    <w:rsid w:val="00E618BF"/>
+  </w:style>
+  <w:style w:type="paragraph" w:styleId="Footer">
+    <w:name w:val="footer"/>
+    <w:basedOn w:val="Normal"/>
+    <w:link w:val="FooterChar"/>
+    <w:uiPriority w:val="99"/>
+    <w:unhideWhenUsed/>
+    <w:rsid w:val="00E618BF"/>
+    <w:pPr>
+      <w:tabs>
+        <w:tab w:val="center" w:pos="4680"/>
+        <w:tab w:val="right" w:pos="9360"/>
+      </w:tabs>
+      <w:spacing w:after="0" w:line="240" w:lineRule="auto"/>
+    </w:pPr>
+  </w:style>
+  <w:style w:type="character" w:customStyle="1" w:styleId="FooterChar">
+    <w:name w:val="Footer Char"/>
+    <w:basedOn w:val="DefaultParagraphFont"/>
+    <w:link w:val="Footer"/>
+    <w:uiPriority w:val="99"/>
+    <w:rsid w:val="00E618BF"/>
   </w:style>
   <w:style w:type="paragraph" w:styleId="NoSpacing">
     <w:name w:val="No Spacing"/>
@@ -12466,6 +12537,17 @@
         <w:shd w:val="clear" w:color="auto" w:fill="FBCAA2" w:themeFill="accent6" w:themeFillTint="7F"/>
       </w:tcPr>
     </w:tblStylePr>
+  </w:style>
+  <w:style w:type="character" w:styleId="Hyperlink">
+    <w:name w:val="Hyperlink"/>
+    <w:basedOn w:val="DefaultParagraphFont"/>
+    <w:uiPriority w:val="99"/>
+    <w:unhideWhenUsed/>
+    <w:rsid w:val="00655E1A"/>
+    <w:rPr>
+      <w:color w:val="0000FF" w:themeColor="hyperlink"/>
+      <w:u w:val="single"/>
+    </w:rPr>
   </w:style>
 </w:styles>
 </file>

</xml_diff>